<commit_message>
Refactor: multi-anchor pipeline, flexible input sources and regenerated outputs
</commit_message>
<xml_diff>
--- a/TechDoc/#2026m08d26 - Math B - DMA - Cross Points and Markers Influence Analysis Specific Requirements & Technical Specifications - #L001-U015-P26.0127 - #Rev 00.00.docx
+++ b/TechDoc/#2026m08d26 - Math B - DMA - Cross Points and Markers Influence Analysis Specific Requirements & Technical Specifications - #L001-U015-P26.0127 - #Rev 00.00.docx
@@ -573,7 +573,7 @@
     </w:p>
     <w:sdt>
       <w:sdtPr>
-        <w:id w:val="-947172341"/>
+        <w:id w:val="1225732636"/>
         <w:docPartObj>
           <w:docPartGallery w:val="Table of Contents"/>
           <w:docPartUnique w:val="1"/>
@@ -3147,6 +3147,7 @@
       <w:pPr>
         <w:spacing w:after="240" w:lineRule="auto"/>
         <w:ind w:left="0" w:firstLine="0"/>
+        <w:jc w:val="both"/>
         <w:rPr/>
       </w:pPr>
       <w:r>
@@ -3180,6 +3181,7 @@
       <w:pPr>
         <w:spacing w:after="240" w:lineRule="auto"/>
         <w:ind w:left="0" w:firstLine="0"/>
+        <w:jc w:val="both"/>
         <w:rPr/>
       </w:pPr>
       <w:r>
@@ -3205,6 +3207,7 @@
     <w:p>
       <w:pPr>
         <w:ind w:left="0" w:firstLine="0"/>
+        <w:jc w:val="both"/>
         <w:rPr/>
       </w:pPr>
       <w:r>
@@ -4130,6 +4133,7 @@
           <w:shd w:fill="auto" w:val="clear"/>
         </w:rPr>
       </w:pPr>
+      <w:commentRangeStart w:id="2"/>
       <w:r>
         <w:rPr>
           <w:b w:val="1"/>
@@ -4155,6 +4159,15 @@
         </w:rPr>
         <w:t xml:space="preserve">Requirement: The component operate autonomously on the consolidated raw percentage-variation dataset produced by the Raw Variation Computation component, ingesting it as a long-format table in which every record identifies a visit, a marker and an anatomical point, together with its raw percentage variation and the associated visit metadata. The component validates the presence of the required fields and doesn’t require input from any other component to complete its computation.</w:t>
       </w:r>
+      <w:commentRangeEnd w:id="2"/>
+      <w:r>
+        <w:commentReference w:id="2"/>
+      </w:r>
+      <w:r>
+        <w:rPr>
+          <w:rtl w:val="0"/>
+        </w:rPr>
+      </w:r>
     </w:p>
     <w:p>
       <w:pPr>
@@ -4250,7 +4263,26 @@
           <w:shd w:fill="auto" w:val="clear"/>
           <w:rtl w:val="0"/>
         </w:rPr>
-        <w:t xml:space="preserve">Requirement: For each (visit, anatomical point) pair, the component reconstructs the ordered sequence of marker measurements that defines the analysis axis along which cross-marker influence is evaluated. The marker acquisition order must be derived deterministically from the order of first appearance of each marker in the input dataset and applied consistently to every (visit, point) series, so that the notions of measurement “preceding” and “subsequent” to a given marker are unambiguously defined.</w:t>
+        <w:t xml:space="preserve">Requirement: For each (visit, anatomical point) pair, the component reconstructs the ordered sequence of marker measurements that defines the analysis axis along which cross-marker influence is evaluated.</w:t>
+      </w:r>
+      <w:commentRangeStart w:id="3"/>
+      <w:r>
+        <w:rPr>
+          <w:shd w:fill="auto" w:val="clear"/>
+          <w:rtl w:val="0"/>
+        </w:rPr>
+        <w:t xml:space="preserve"> The marker acquisition order must be derived deterministically from the order of first appearance of each marker in the input dataset</w:t>
+      </w:r>
+      <w:commentRangeEnd w:id="3"/>
+      <w:r>
+        <w:commentReference w:id="3"/>
+      </w:r>
+      <w:r>
+        <w:rPr>
+          <w:shd w:fill="auto" w:val="clear"/>
+          <w:rtl w:val="0"/>
+        </w:rPr>
+        <w:t xml:space="preserve"> and applied consistently to every (visit, point) series, so that the notions of measurement “preceding” and “subsequent” to a given marker are unambiguously defined.</w:t>
       </w:r>
     </w:p>
     <w:p>
@@ -4541,7 +4573,64 @@
           <w:shd w:fill="auto" w:val="clear"/>
           <w:rtl w:val="0"/>
         </w:rPr>
-        <w:t xml:space="preserve">Requirement: Starting from the first positive of each (visit, point) series, the component determines the influence (descent) window as the anchor followed by the maximal initial run of non-increasing consecutive marker measurements. The window must be closed at the first significant rise — defined as the first consecutive increase exceeding the configured rise tolerance ε — which marks the end of the positive’s influence, and shall in any case be truncated to at most N_max points to prevent an excessively long descent. The number of points retained must therefore be adaptive to the actual length of the descent preceding the rise.</w:t>
+        <w:t xml:space="preserve">Requirement: Starting from the first positive of each (visit, point) series, the component determines the influence (descent) window as the anchor followed by the maximal initial run of non-increasing consecutive marker measurements. </w:t>
+      </w:r>
+      <w:commentRangeStart w:id="4"/>
+      <w:r>
+        <w:rPr>
+          <w:shd w:fill="auto" w:val="clear"/>
+          <w:rtl w:val="0"/>
+        </w:rPr>
+        <w:t xml:space="preserve">The window must be closed at the first significant rise</w:t>
+      </w:r>
+      <w:commentRangeEnd w:id="4"/>
+      <w:r>
+        <w:commentReference w:id="4"/>
+      </w:r>
+      <w:r>
+        <w:rPr>
+          <w:shd w:fill="auto" w:val="clear"/>
+          <w:rtl w:val="0"/>
+        </w:rPr>
+        <w:t xml:space="preserve"> — defined as the first consecutive increase exceeding the configured rise </w:t>
+      </w:r>
+      <w:commentRangeStart w:id="5"/>
+      <w:r>
+        <w:rPr>
+          <w:shd w:fill="auto" w:val="clear"/>
+          <w:rtl w:val="0"/>
+        </w:rPr>
+        <w:t xml:space="preserve">tolerance ε</w:t>
+      </w:r>
+      <w:commentRangeEnd w:id="5"/>
+      <w:r>
+        <w:commentReference w:id="5"/>
+      </w:r>
+      <w:r>
+        <w:rPr>
+          <w:shd w:fill="auto" w:val="clear"/>
+          <w:rtl w:val="0"/>
+        </w:rPr>
+        <w:t xml:space="preserve"> — which marks the end of the positive’s influence, and shall in any case be truncated to at most N_max points </w:t>
+      </w:r>
+      <w:commentRangeStart w:id="6"/>
+      <w:r>
+        <w:rPr>
+          <w:shd w:fill="auto" w:val="clear"/>
+          <w:rtl w:val="0"/>
+        </w:rPr>
+        <w:t xml:space="preserve">to prevent an excessively long descent</w:t>
+      </w:r>
+      <w:commentRangeEnd w:id="6"/>
+      <w:r>
+        <w:commentReference w:id="6"/>
+      </w:r>
+      <w:r>
+        <w:rPr>
+          <w:shd w:fill="auto" w:val="clear"/>
+          <w:rtl w:val="0"/>
+        </w:rPr>
+        <w:t xml:space="preserve">. The number of points retained must therefore be adaptive to the actual length of the descent preceding the rise.</w:t>
       </w:r>
     </w:p>
     <w:p>
@@ -4929,7 +5018,26 @@
           <w:shd w:fill="auto" w:val="clear"/>
           <w:rtl w:val="0"/>
         </w:rPr>
-        <w:t xml:space="preserve">Requirement: The component consolidate its results into tidy (long-format) outputs at two levels: a per-(visit, point) record carrying the first-positive anchor, the descent-window characteristics (slope, depth, length, mean per-step decrease) and the pre/post variance indicators; and a per-point aggregation across all visits summarising the prevalence of positives and the central tendency (e.g. median) of the descent metrics. Each output record must be uniquely identified by its grouping keys together with the relevant visit metadata.</w:t>
+        <w:t xml:space="preserve">Requirement: The component consolidate its results into tidy (long-format) outputs at two levels: a per-(visit, point) record carrying the first-positive anchor, the descent-window characteristics (slope, depth, length, mean per-step decrease) and the pre/post variance indicators; and a per-point aggregation across all visits summarising the prevalence of positives and the central tendency (e.g. </w:t>
+      </w:r>
+      <w:commentRangeStart w:id="7"/>
+      <w:r>
+        <w:rPr>
+          <w:shd w:fill="auto" w:val="clear"/>
+          <w:rtl w:val="0"/>
+        </w:rPr>
+        <w:t xml:space="preserve">median</w:t>
+      </w:r>
+      <w:commentRangeEnd w:id="7"/>
+      <w:r>
+        <w:commentReference w:id="7"/>
+      </w:r>
+      <w:r>
+        <w:rPr>
+          <w:shd w:fill="auto" w:val="clear"/>
+          <w:rtl w:val="0"/>
+        </w:rPr>
+        <w:t xml:space="preserve">) of the descent metrics. Each output record must be uniquely identified by its grouping keys together with the relevant visit metadata.</w:t>
       </w:r>
     </w:p>
     <w:p>
@@ -8275,8 +8383,8 @@
         <w:ind w:left="720" w:hanging="360"/>
         <w:rPr/>
         <w:sectPr>
-          <w:headerReference r:id="rId7" w:type="default"/>
-          <w:footerReference r:id="rId8" w:type="default"/>
+          <w:headerReference r:id="rId10" w:type="default"/>
+          <w:footerReference r:id="rId11" w:type="default"/>
           <w:pgSz w:h="16834" w:w="11909" w:orient="portrait"/>
           <w:pgMar w:bottom="1440" w:top="1440" w:left="1440" w:right="1440" w:header="720" w:footer="720"/>
           <w:pgNumType w:start="1"/>
@@ -10846,7 +10954,7 @@
 
 <file path=word/comments.xml><?xml version="1.0" encoding="utf-8"?>
 <w:comments xmlns:mc="http://schemas.openxmlformats.org/markup-compatibility/2006" xmlns:o="urn:schemas-microsoft-com:office:office" xmlns:r="http://schemas.openxmlformats.org/officeDocument/2006/relationships" xmlns:m="http://schemas.openxmlformats.org/officeDocument/2006/math" xmlns:v="urn:schemas-microsoft-com:vml" xmlns:wp="http://schemas.openxmlformats.org/drawingml/2006/wordprocessingDrawing" xmlns:w10="urn:schemas-microsoft-com:office:word" xmlns:w="http://schemas.openxmlformats.org/wordprocessingml/2006/main" xmlns:wne="http://schemas.microsoft.com/office/word/2006/wordml" xmlns:sl="http://schemas.openxmlformats.org/schemaLibrary/2006/main" xmlns:a="http://schemas.openxmlformats.org/drawingml/2006/main" xmlns:pic="http://schemas.openxmlformats.org/drawingml/2006/picture" xmlns:c="http://schemas.openxmlformats.org/drawingml/2006/chart" xmlns:lc="http://schemas.openxmlformats.org/drawingml/2006/lockedCanvas" xmlns:dgm="http://schemas.openxmlformats.org/drawingml/2006/diagram" xmlns:wps="http://schemas.microsoft.com/office/word/2010/wordprocessingShape" xmlns:wpg="http://schemas.microsoft.com/office/word/2010/wordprocessingGroup" xmlns:w14="http://schemas.microsoft.com/office/word/2010/wordml" xmlns:w15="http://schemas.microsoft.com/office/word/2012/wordml" xmlns:w16="http://schemas.microsoft.com/office/word/2018/wordml" xmlns:w16cex="http://schemas.microsoft.com/office/word/2018/wordml/cex" xmlns:w16cid="http://schemas.microsoft.com/office/word/2016/wordml/cid" xmlns="http://schemas.microsoft.com/office/tasks/2019/documenttasks" xmlns:cr="http://schemas.microsoft.com/office/comments/2020/reactions">
-  <w:comment w:author="Ilaria Rocco" w:id="0" w:date="2026-08-31T14:45:36Z">
+  <w:comment w:author="Ilaria Rocco" w:id="7" w:date="2026-08-31T15:54:01Z">
     <w:p>
       <w:pPr>
         <w:keepNext w:val="0"/>
@@ -10897,11 +11005,11 @@
           <w:vertAlign w:val="baseline"/>
           <w:rtl w:val="0"/>
         </w:rPr>
-        <w:t xml:space="preserve">temporary name</w:t>
+        <w:t xml:space="preserve">It is necessary to specify whether a minimum number of positive visits is required to calculate the median, and how to handle values below the threshold (NaN, WARNING, exclusion from output).</w:t>
       </w:r>
     </w:p>
   </w:comment>
-  <w:comment w:author="Ilaria Rocco" w:id="1" w:date="2026-08-31T14:47:15Z">
+  <w:comment w:author="Ilaria Rocco" w:id="4" w:date="2026-08-31T15:47:32Z">
     <w:p>
       <w:pPr>
         <w:keepNext w:val="0"/>
@@ -10952,11 +11060,443 @@
           <w:vertAlign w:val="baseline"/>
           <w:rtl w:val="0"/>
         </w:rPr>
+        <w:t xml:space="preserve">In `descent_window.py`, NaN values following the anchor are "skipped": `prev` retains the last valid value, and the NaN counter does not consume `n_max` slots. This means a window can span more positions in the sequence than `n_max` implies, and the OLS slope is calculated using points that are not temporally adjacent.</w:t>
+      </w:r>
+    </w:p>
+  </w:comment>
+  <w:comment w:author="Ilaria Rocco" w:id="5" w:date="2026-08-31T15:52:27Z">
+    <w:p>
+      <w:pPr>
+        <w:keepNext w:val="0"/>
+        <w:keepLines w:val="0"/>
+        <w:pageBreakBefore w:val="0"/>
+        <w:widowControl w:val="0"/>
+        <w:pBdr>
+          <w:top w:space="0" w:sz="0" w:val="nil"/>
+          <w:left w:space="0" w:sz="0" w:val="nil"/>
+          <w:bottom w:space="0" w:sz="0" w:val="nil"/>
+          <w:right w:space="0" w:sz="0" w:val="nil"/>
+          <w:between w:space="0" w:sz="0" w:val="nil"/>
+        </w:pBdr>
+        <w:shd w:fill="auto" w:val="clear"/>
+        <w:spacing w:after="0" w:before="0" w:line="240" w:lineRule="auto"/>
+        <w:ind w:left="0" w:right="0" w:firstLine="0"/>
+        <w:jc w:val="left"/>
+        <w:rPr>
+          <w:rFonts w:ascii="Arial" w:cs="Arial" w:eastAsia="Arial" w:hAnsi="Arial"/>
+          <w:b w:val="0"/>
+          <w:bCs w:val="0"/>
+          <w:i w:val="0"/>
+          <w:iCs w:val="0"/>
+          <w:smallCaps w:val="0"/>
+          <w:strike w:val="0"/>
+          <w:color w:val="000000"/>
+          <w:sz w:val="22"/>
+          <w:szCs w:val="22"/>
+          <w:u w:val="none"/>
+          <w:shd w:fill="auto" w:val="clear"/>
+          <w:vertAlign w:val="baseline"/>
+        </w:rPr>
+      </w:pPr>
+      <w:r>
+        <w:rPr>
+          <w:rFonts w:ascii="Arial" w:cs="Arial" w:eastAsia="Arial" w:hAnsi="Arial"/>
+          <w:b w:val="0"/>
+          <w:bCs w:val="0"/>
+          <w:i w:val="0"/>
+          <w:iCs w:val="0"/>
+          <w:smallCaps w:val="0"/>
+          <w:strike w:val="0"/>
+          <w:color w:val="000000"/>
+          <w:sz w:val="22"/>
+          <w:szCs w:val="22"/>
+          <w:u w:val="none"/>
+          <w:shd w:fill="auto" w:val="clear"/>
+          <w:vertAlign w:val="baseline"/>
+          <w:rtl w:val="0"/>
+        </w:rPr>
+        <w:t xml:space="preserve">With epsilon = 0, the closing condition is `val - prev &gt; 0`; in other words, any strictly positive increase closes the window. A value identical to the previous one (a plateau) does not close the window. The expected behavior in the event of a plateau needs to be defined.</w:t>
+      </w:r>
+    </w:p>
+  </w:comment>
+  <w:comment w:author="Ilaria Rocco" w:id="0" w:date="2026-08-31T14:45:36Z">
+    <w:p>
+      <w:pPr>
+        <w:keepNext w:val="0"/>
+        <w:keepLines w:val="0"/>
+        <w:pageBreakBefore w:val="0"/>
+        <w:widowControl w:val="0"/>
+        <w:pBdr>
+          <w:top w:space="0" w:sz="0" w:val="nil"/>
+          <w:left w:space="0" w:sz="0" w:val="nil"/>
+          <w:bottom w:space="0" w:sz="0" w:val="nil"/>
+          <w:right w:space="0" w:sz="0" w:val="nil"/>
+          <w:between w:space="0" w:sz="0" w:val="nil"/>
+        </w:pBdr>
+        <w:shd w:fill="auto" w:val="clear"/>
+        <w:spacing w:after="0" w:before="0" w:line="240" w:lineRule="auto"/>
+        <w:ind w:left="0" w:right="0" w:firstLine="0"/>
+        <w:jc w:val="left"/>
+        <w:rPr>
+          <w:rFonts w:ascii="Arial" w:cs="Arial" w:eastAsia="Arial" w:hAnsi="Arial"/>
+          <w:b w:val="0"/>
+          <w:bCs w:val="0"/>
+          <w:i w:val="0"/>
+          <w:iCs w:val="0"/>
+          <w:smallCaps w:val="0"/>
+          <w:strike w:val="0"/>
+          <w:color w:val="000000"/>
+          <w:sz w:val="22"/>
+          <w:szCs w:val="22"/>
+          <w:u w:val="none"/>
+          <w:shd w:fill="auto" w:val="clear"/>
+          <w:vertAlign w:val="baseline"/>
+        </w:rPr>
+      </w:pPr>
+      <w:r>
+        <w:rPr>
+          <w:rFonts w:ascii="Arial" w:cs="Arial" w:eastAsia="Arial" w:hAnsi="Arial"/>
+          <w:b w:val="0"/>
+          <w:bCs w:val="0"/>
+          <w:i w:val="0"/>
+          <w:iCs w:val="0"/>
+          <w:smallCaps w:val="0"/>
+          <w:strike w:val="0"/>
+          <w:color w:val="000000"/>
+          <w:sz w:val="22"/>
+          <w:szCs w:val="22"/>
+          <w:u w:val="none"/>
+          <w:shd w:fill="auto" w:val="clear"/>
+          <w:vertAlign w:val="baseline"/>
+          <w:rtl w:val="0"/>
+        </w:rPr>
+        <w:t xml:space="preserve">temporary name</w:t>
+      </w:r>
+    </w:p>
+  </w:comment>
+  <w:comment w:author="Ilaria Rocco" w:id="3" w:date="2026-08-31T15:44:42Z">
+    <w:p>
+      <w:pPr>
+        <w:keepNext w:val="0"/>
+        <w:keepLines w:val="0"/>
+        <w:pageBreakBefore w:val="0"/>
+        <w:widowControl w:val="0"/>
+        <w:pBdr>
+          <w:top w:space="0" w:sz="0" w:val="nil"/>
+          <w:left w:space="0" w:sz="0" w:val="nil"/>
+          <w:bottom w:space="0" w:sz="0" w:val="nil"/>
+          <w:right w:space="0" w:sz="0" w:val="nil"/>
+          <w:between w:space="0" w:sz="0" w:val="nil"/>
+        </w:pBdr>
+        <w:shd w:fill="auto" w:val="clear"/>
+        <w:spacing w:after="0" w:before="0" w:line="240" w:lineRule="auto"/>
+        <w:ind w:left="0" w:right="0" w:firstLine="0"/>
+        <w:jc w:val="left"/>
+        <w:rPr>
+          <w:rFonts w:ascii="Arial" w:cs="Arial" w:eastAsia="Arial" w:hAnsi="Arial"/>
+          <w:b w:val="0"/>
+          <w:bCs w:val="0"/>
+          <w:i w:val="0"/>
+          <w:iCs w:val="0"/>
+          <w:smallCaps w:val="0"/>
+          <w:strike w:val="0"/>
+          <w:color w:val="000000"/>
+          <w:sz w:val="22"/>
+          <w:szCs w:val="22"/>
+          <w:u w:val="none"/>
+          <w:shd w:fill="auto" w:val="clear"/>
+          <w:vertAlign w:val="baseline"/>
+        </w:rPr>
+      </w:pPr>
+      <w:r>
+        <w:rPr>
+          <w:rFonts w:ascii="Arial" w:cs="Arial" w:eastAsia="Arial" w:hAnsi="Arial"/>
+          <w:b w:val="0"/>
+          <w:bCs w:val="0"/>
+          <w:i w:val="0"/>
+          <w:iCs w:val="0"/>
+          <w:smallCaps w:val="0"/>
+          <w:strike w:val="0"/>
+          <w:color w:val="000000"/>
+          <w:sz w:val="22"/>
+          <w:szCs w:val="22"/>
+          <w:u w:val="none"/>
+          <w:shd w:fill="auto" w:val="clear"/>
+          <w:vertAlign w:val="baseline"/>
+          <w:rtl w:val="0"/>
+        </w:rPr>
+        <w:t xml:space="preserve">The order of the markers is derived from their order of first appearance in the file (using `dict.fromkeys`). This works correctly only if the rows are already sorted by the time of acquisition. If the upstream CSV is sorted by point or marker rather than by time, the reconstructed order will not reflect the actual measurement sequence, and the identified anchor will be incorrect. It must be explicitly specified that the input CSV rows be sorted by chronological order of acquisition within each visit.</w:t>
+      </w:r>
+    </w:p>
+  </w:comment>
+  <w:comment w:author="Ilaria Rocco" w:id="6" w:date="2026-08-31T15:50:06Z">
+    <w:p>
+      <w:pPr>
+        <w:keepNext w:val="0"/>
+        <w:keepLines w:val="0"/>
+        <w:pageBreakBefore w:val="0"/>
+        <w:widowControl w:val="0"/>
+        <w:pBdr>
+          <w:top w:space="0" w:sz="0" w:val="nil"/>
+          <w:left w:space="0" w:sz="0" w:val="nil"/>
+          <w:bottom w:space="0" w:sz="0" w:val="nil"/>
+          <w:right w:space="0" w:sz="0" w:val="nil"/>
+          <w:between w:space="0" w:sz="0" w:val="nil"/>
+        </w:pBdr>
+        <w:shd w:fill="auto" w:val="clear"/>
+        <w:spacing w:after="0" w:before="0" w:line="240" w:lineRule="auto"/>
+        <w:ind w:left="0" w:right="0" w:firstLine="0"/>
+        <w:jc w:val="left"/>
+        <w:rPr>
+          <w:rFonts w:ascii="Arial" w:cs="Arial" w:eastAsia="Arial" w:hAnsi="Arial"/>
+          <w:b w:val="0"/>
+          <w:bCs w:val="0"/>
+          <w:i w:val="0"/>
+          <w:iCs w:val="0"/>
+          <w:smallCaps w:val="0"/>
+          <w:strike w:val="0"/>
+          <w:color w:val="000000"/>
+          <w:sz w:val="22"/>
+          <w:szCs w:val="22"/>
+          <w:u w:val="none"/>
+          <w:shd w:fill="auto" w:val="clear"/>
+          <w:vertAlign w:val="baseline"/>
+        </w:rPr>
+      </w:pPr>
+      <w:r>
+        <w:rPr>
+          <w:rFonts w:ascii="Arial" w:cs="Arial" w:eastAsia="Arial" w:hAnsi="Arial"/>
+          <w:b w:val="0"/>
+          <w:bCs w:val="0"/>
+          <w:i w:val="0"/>
+          <w:iCs w:val="0"/>
+          <w:smallCaps w:val="0"/>
+          <w:strike w:val="0"/>
+          <w:color w:val="000000"/>
+          <w:sz w:val="22"/>
+          <w:szCs w:val="22"/>
+          <w:u w:val="none"/>
+          <w:shd w:fill="auto" w:val="clear"/>
+          <w:vertAlign w:val="baseline"/>
+          <w:rtl w:val="0"/>
+        </w:rPr>
+        <w:t xml:space="preserve">The descent window does not guarantee values that are actually decreasing.</w:t>
+      </w:r>
+      <w:r>
+        <w:rPr>
+          <w:rtl w:val="0"/>
+        </w:rPr>
+      </w:r>
+    </w:p>
+    <w:p>
+      <w:pPr>
+        <w:keepNext w:val="0"/>
+        <w:keepLines w:val="0"/>
+        <w:pageBreakBefore w:val="0"/>
+        <w:widowControl w:val="0"/>
+        <w:pBdr>
+          <w:top w:space="0" w:sz="0" w:val="nil"/>
+          <w:left w:space="0" w:sz="0" w:val="nil"/>
+          <w:bottom w:space="0" w:sz="0" w:val="nil"/>
+          <w:right w:space="0" w:sz="0" w:val="nil"/>
+          <w:between w:space="0" w:sz="0" w:val="nil"/>
+        </w:pBdr>
+        <w:shd w:fill="auto" w:val="clear"/>
+        <w:spacing w:after="0" w:before="0" w:line="240" w:lineRule="auto"/>
+        <w:ind w:left="0" w:right="0" w:firstLine="0"/>
+        <w:jc w:val="left"/>
+        <w:rPr>
+          <w:rFonts w:ascii="Arial" w:cs="Arial" w:eastAsia="Arial" w:hAnsi="Arial"/>
+          <w:b w:val="0"/>
+          <w:bCs w:val="0"/>
+          <w:i w:val="0"/>
+          <w:iCs w:val="0"/>
+          <w:smallCaps w:val="0"/>
+          <w:strike w:val="0"/>
+          <w:color w:val="000000"/>
+          <w:sz w:val="22"/>
+          <w:szCs w:val="22"/>
+          <w:u w:val="none"/>
+          <w:shd w:fill="auto" w:val="clear"/>
+          <w:vertAlign w:val="baseline"/>
+        </w:rPr>
+      </w:pPr>
+      <w:r>
+        <w:rPr>
+          <w:rtl w:val="0"/>
+        </w:rPr>
+      </w:r>
+      <w:r>
+        <w:rPr>
+          <w:rFonts w:ascii="Arial Unicode MS" w:cs="Arial Unicode MS" w:eastAsia="Arial Unicode MS" w:hAnsi="Arial Unicode MS"/>
+          <w:b w:val="0"/>
+          <w:bCs w:val="0"/>
+          <w:i w:val="0"/>
+          <w:iCs w:val="0"/>
+          <w:smallCaps w:val="0"/>
+          <w:strike w:val="0"/>
+          <w:color w:val="000000"/>
+          <w:sz w:val="22"/>
+          <w:szCs w:val="22"/>
+          <w:u w:val="none"/>
+          <w:shd w:fill="auto" w:val="clear"/>
+          <w:vertAlign w:val="baseline"/>
+          <w:rtl w:val="0"/>
+        </w:rPr>
+        <w:t xml:space="preserve">The termination check is `val - prev &gt; epsilon`. If `epsilon` is sufficiently large, slowly increasing values fall within the window. Example with `epsilon=5`: anchor=300, subsequent values 305, 310 → window=[300, 305, 310], depth=0, mean_per_step_decrease=0. "Descent" is not guaranteed by the algorithm—only the absence of sharp spikes exceeding `epsilon` is ensured. It must be clarified whether the window represents an actual descent or the absence of a significant rise, and which interpretation is more appropriate.</w:t>
+      </w:r>
+    </w:p>
+  </w:comment>
+  <w:comment w:author="Ilaria Rocco" w:id="1" w:date="2026-08-31T14:47:15Z">
+    <w:p>
+      <w:pPr>
+        <w:keepNext w:val="0"/>
+        <w:keepLines w:val="0"/>
+        <w:pageBreakBefore w:val="0"/>
+        <w:widowControl w:val="0"/>
+        <w:pBdr>
+          <w:top w:space="0" w:sz="0" w:val="nil"/>
+          <w:left w:space="0" w:sz="0" w:val="nil"/>
+          <w:bottom w:space="0" w:sz="0" w:val="nil"/>
+          <w:right w:space="0" w:sz="0" w:val="nil"/>
+          <w:between w:space="0" w:sz="0" w:val="nil"/>
+        </w:pBdr>
+        <w:shd w:fill="auto" w:val="clear"/>
+        <w:spacing w:after="0" w:before="0" w:line="240" w:lineRule="auto"/>
+        <w:ind w:left="0" w:right="0" w:firstLine="0"/>
+        <w:jc w:val="left"/>
+        <w:rPr>
+          <w:rFonts w:ascii="Arial" w:cs="Arial" w:eastAsia="Arial" w:hAnsi="Arial"/>
+          <w:b w:val="0"/>
+          <w:bCs w:val="0"/>
+          <w:i w:val="0"/>
+          <w:iCs w:val="0"/>
+          <w:smallCaps w:val="0"/>
+          <w:strike w:val="0"/>
+          <w:color w:val="000000"/>
+          <w:sz w:val="22"/>
+          <w:szCs w:val="22"/>
+          <w:u w:val="none"/>
+          <w:shd w:fill="auto" w:val="clear"/>
+          <w:vertAlign w:val="baseline"/>
+        </w:rPr>
+      </w:pPr>
+      <w:r>
+        <w:rPr>
+          <w:rFonts w:ascii="Arial" w:cs="Arial" w:eastAsia="Arial" w:hAnsi="Arial"/>
+          <w:b w:val="0"/>
+          <w:bCs w:val="0"/>
+          <w:i w:val="0"/>
+          <w:iCs w:val="0"/>
+          <w:smallCaps w:val="0"/>
+          <w:strike w:val="0"/>
+          <w:color w:val="000000"/>
+          <w:sz w:val="22"/>
+          <w:szCs w:val="22"/>
+          <w:u w:val="none"/>
+          <w:shd w:fill="auto" w:val="clear"/>
+          <w:vertAlign w:val="baseline"/>
+          <w:rtl w:val="0"/>
+        </w:rPr>
         <w:t xml:space="preserve">ID not assigned yet</w:t>
+      </w:r>
+    </w:p>
+  </w:comment>
+  <w:comment w:author="Ilaria Rocco" w:id="2" w:date="2026-08-31T15:38:45Z">
+    <w:p>
+      <w:pPr>
+        <w:keepNext w:val="0"/>
+        <w:keepLines w:val="0"/>
+        <w:pageBreakBefore w:val="0"/>
+        <w:widowControl w:val="0"/>
+        <w:pBdr>
+          <w:top w:space="0" w:sz="0" w:val="nil"/>
+          <w:left w:space="0" w:sz="0" w:val="nil"/>
+          <w:bottom w:space="0" w:sz="0" w:val="nil"/>
+          <w:right w:space="0" w:sz="0" w:val="nil"/>
+          <w:between w:space="0" w:sz="0" w:val="nil"/>
+        </w:pBdr>
+        <w:shd w:fill="auto" w:val="clear"/>
+        <w:spacing w:after="0" w:before="0" w:line="240" w:lineRule="auto"/>
+        <w:ind w:left="0" w:right="0" w:firstLine="0"/>
+        <w:jc w:val="left"/>
+        <w:rPr>
+          <w:rFonts w:ascii="Arial" w:cs="Arial" w:eastAsia="Arial" w:hAnsi="Arial"/>
+          <w:b w:val="0"/>
+          <w:bCs w:val="0"/>
+          <w:i w:val="0"/>
+          <w:iCs w:val="0"/>
+          <w:smallCaps w:val="0"/>
+          <w:strike w:val="0"/>
+          <w:color w:val="000000"/>
+          <w:sz w:val="22"/>
+          <w:szCs w:val="22"/>
+          <w:u w:val="none"/>
+          <w:shd w:fill="auto" w:val="clear"/>
+          <w:vertAlign w:val="baseline"/>
+        </w:rPr>
+      </w:pPr>
+      <w:r>
+        <w:rPr>
+          <w:rFonts w:ascii="Arial" w:cs="Arial" w:eastAsia="Arial" w:hAnsi="Arial"/>
+          <w:b w:val="0"/>
+          <w:bCs w:val="0"/>
+          <w:i w:val="0"/>
+          <w:iCs w:val="0"/>
+          <w:smallCaps w:val="0"/>
+          <w:strike w:val="0"/>
+          <w:color w:val="000000"/>
+          <w:sz w:val="22"/>
+          <w:szCs w:val="22"/>
+          <w:u w:val="none"/>
+          <w:shd w:fill="auto" w:val="clear"/>
+          <w:vertAlign w:val="baseline"/>
+          <w:rtl w:val="0"/>
+        </w:rPr>
+        <w:t xml:space="preserve">The pipeline handles the case where the same marker is measured multiple times at the same point during a single visit via a controlled failure (SequenceError) if the values differ, or through silent deduplication if they are identical. There is no aggregation strategy; the design assumption is that every (visit, point, marker) combination must be unique in the input. If this assumption does not hold for the actual data, the issue must be addressed upstream—in the component generating the input CSV—before the data reaches CPM-IA.</w:t>
       </w:r>
     </w:p>
   </w:comment>
 </w:comments>
+</file>
+
+<file path=word/commentsExtended.xml><?xml version="1.0" encoding="utf-8"?>
+<w15:commentsEx xmlns:mc="http://schemas.openxmlformats.org/markup-compatibility/2006" xmlns:o="urn:schemas-microsoft-com:office:office" xmlns:r="http://schemas.openxmlformats.org/officeDocument/2006/relationships" xmlns:m="http://schemas.openxmlformats.org/officeDocument/2006/math" xmlns:v="urn:schemas-microsoft-com:vml" xmlns:wp="http://schemas.openxmlformats.org/drawingml/2006/wordprocessingDrawing" xmlns:w10="urn:schemas-microsoft-com:office:word" xmlns:w="http://schemas.openxmlformats.org/wordprocessingml/2006/main" xmlns:wne="http://schemas.microsoft.com/office/word/2006/wordml" xmlns:sl="http://schemas.openxmlformats.org/schemaLibrary/2006/main" xmlns:a="http://schemas.openxmlformats.org/drawingml/2006/main" xmlns:pic="http://schemas.openxmlformats.org/drawingml/2006/picture" xmlns:c="http://schemas.openxmlformats.org/drawingml/2006/chart" xmlns:lc="http://schemas.openxmlformats.org/drawingml/2006/lockedCanvas" xmlns:dgm="http://schemas.openxmlformats.org/drawingml/2006/diagram" xmlns:wps="http://schemas.microsoft.com/office/word/2010/wordprocessingShape" xmlns:wpg="http://schemas.microsoft.com/office/word/2010/wordprocessingGroup" xmlns:w14="http://schemas.microsoft.com/office/word/2010/wordml" xmlns:w15="http://schemas.microsoft.com/office/word/2012/wordml" xmlns:w16="http://schemas.microsoft.com/office/word/2018/wordml" xmlns:w16cex="http://schemas.microsoft.com/office/word/2018/wordml/cex" xmlns:w16cid="http://schemas.microsoft.com/office/word/2016/wordml/cid" xmlns="http://schemas.microsoft.com/office/tasks/2019/documenttasks" xmlns:cr="http://schemas.microsoft.com/office/comments/2020/reactions">
+  <w15:commentEx w15:paraId="000001DF" w15:done="0"/>
+  <w15:commentEx w15:paraId="000001E0" w15:done="0"/>
+  <w15:commentEx w15:paraId="000001E1" w15:done="0"/>
+  <w15:commentEx w15:paraId="000001E2" w15:done="0"/>
+  <w15:commentEx w15:paraId="000001E3" w15:done="0"/>
+  <w15:commentEx w15:paraId="000001E5" w15:done="0"/>
+  <w15:commentEx w15:paraId="000001E6" w15:done="0"/>
+  <w15:commentEx w15:paraId="000001E7" w15:done="0"/>
+</w15:commentsEx>
+</file>
+
+<file path=word/commentsExtensible.xml><?xml version="1.0" encoding="utf-8"?>
+<w16cex:commentsExtensible xmlns:mc="http://schemas.openxmlformats.org/markup-compatibility/2006" xmlns:o="urn:schemas-microsoft-com:office:office" xmlns:r="http://schemas.openxmlformats.org/officeDocument/2006/relationships" xmlns:m="http://schemas.openxmlformats.org/officeDocument/2006/math" xmlns:v="urn:schemas-microsoft-com:vml" xmlns:wp="http://schemas.openxmlformats.org/drawingml/2006/wordprocessingDrawing" xmlns:w10="urn:schemas-microsoft-com:office:word" xmlns:w="http://schemas.openxmlformats.org/wordprocessingml/2006/main" xmlns:wne="http://schemas.microsoft.com/office/word/2006/wordml" xmlns:sl="http://schemas.openxmlformats.org/schemaLibrary/2006/main" xmlns:a="http://schemas.openxmlformats.org/drawingml/2006/main" xmlns:pic="http://schemas.openxmlformats.org/drawingml/2006/picture" xmlns:c="http://schemas.openxmlformats.org/drawingml/2006/chart" xmlns:lc="http://schemas.openxmlformats.org/drawingml/2006/lockedCanvas" xmlns:dgm="http://schemas.openxmlformats.org/drawingml/2006/diagram" xmlns:wps="http://schemas.microsoft.com/office/word/2010/wordprocessingShape" xmlns:wpg="http://schemas.microsoft.com/office/word/2010/wordprocessingGroup" xmlns:w14="http://schemas.microsoft.com/office/word/2010/wordml" xmlns:w15="http://schemas.microsoft.com/office/word/2012/wordml" xmlns:w16="http://schemas.microsoft.com/office/word/2018/wordml" xmlns:w16cex="http://schemas.microsoft.com/office/word/2018/wordml/cex" xmlns:w16cid="http://schemas.microsoft.com/office/word/2016/wordml/cid" xmlns="http://schemas.microsoft.com/office/tasks/2019/documenttasks" xmlns:cr="http://schemas.microsoft.com/office/comments/2020/reactions">
+  <w16cex:commentExtensible w16cex:durableId="00000001" w16cex:dateUtc="2026-08-31T15:54:01Z"/>
+  <w16cex:commentExtensible w16cex:durableId="00000002" w16cex:dateUtc="2026-08-31T15:47:32Z"/>
+  <w16cex:commentExtensible w16cex:durableId="00000003" w16cex:dateUtc="2026-08-31T15:52:27Z"/>
+  <w16cex:commentExtensible w16cex:durableId="00000004" w16cex:dateUtc="2026-08-31T14:45:36Z"/>
+  <w16cex:commentExtensible w16cex:durableId="00000005" w16cex:dateUtc="2026-08-31T15:44:42Z"/>
+  <w16cex:commentExtensible w16cex:durableId="00000006" w16cex:dateUtc="2026-08-31T15:50:06Z"/>
+  <w16cex:commentExtensible w16cex:durableId="00000007" w16cex:dateUtc="2026-08-31T14:47:15Z"/>
+  <w16cex:commentExtensible w16cex:durableId="00000008" w16cex:dateUtc="2026-08-31T15:38:45Z"/>
+</w16cex:commentsExtensible>
+</file>
+
+<file path=word/commentsIds.xml><?xml version="1.0" encoding="utf-8"?>
+<w16cid:commentsIds xmlns:mc="http://schemas.openxmlformats.org/markup-compatibility/2006" xmlns:o="urn:schemas-microsoft-com:office:office" xmlns:r="http://schemas.openxmlformats.org/officeDocument/2006/relationships" xmlns:m="http://schemas.openxmlformats.org/officeDocument/2006/math" xmlns:v="urn:schemas-microsoft-com:vml" xmlns:wp="http://schemas.openxmlformats.org/drawingml/2006/wordprocessingDrawing" xmlns:w10="urn:schemas-microsoft-com:office:word" xmlns:w="http://schemas.openxmlformats.org/wordprocessingml/2006/main" xmlns:wne="http://schemas.microsoft.com/office/word/2006/wordml" xmlns:sl="http://schemas.openxmlformats.org/schemaLibrary/2006/main" xmlns:a="http://schemas.openxmlformats.org/drawingml/2006/main" xmlns:pic="http://schemas.openxmlformats.org/drawingml/2006/picture" xmlns:c="http://schemas.openxmlformats.org/drawingml/2006/chart" xmlns:lc="http://schemas.openxmlformats.org/drawingml/2006/lockedCanvas" xmlns:dgm="http://schemas.openxmlformats.org/drawingml/2006/diagram" xmlns:wps="http://schemas.microsoft.com/office/word/2010/wordprocessingShape" xmlns:wpg="http://schemas.microsoft.com/office/word/2010/wordprocessingGroup" xmlns:w14="http://schemas.microsoft.com/office/word/2010/wordml" xmlns:w15="http://schemas.microsoft.com/office/word/2012/wordml" xmlns:w16="http://schemas.microsoft.com/office/word/2018/wordml" xmlns:w16cex="http://schemas.microsoft.com/office/word/2018/wordml/cex" xmlns:w16cid="http://schemas.microsoft.com/office/word/2016/wordml/cid" xmlns="http://schemas.microsoft.com/office/tasks/2019/documenttasks" xmlns:cr="http://schemas.microsoft.com/office/comments/2020/reactions">
+  <w16cid:commentId w16cid:paraId="000001DF" w16cid:durableId="00000001"/>
+  <w16cid:commentId w16cid:paraId="000001E0" w16cid:durableId="00000002"/>
+  <w16cid:commentId w16cid:paraId="000001E1" w16cid:durableId="00000003"/>
+  <w16cid:commentId w16cid:paraId="000001E2" w16cid:durableId="00000004"/>
+  <w16cid:commentId w16cid:paraId="000001E3" w16cid:durableId="00000005"/>
+  <w16cid:commentId w16cid:paraId="000001E5" w16cid:durableId="00000006"/>
+  <w16cid:commentId w16cid:paraId="000001E6" w16cid:durableId="00000007"/>
+  <w16cid:commentId w16cid:paraId="000001E7" w16cid:durableId="00000008"/>
+</w16cid:commentsIds>
 </file>
 
 <file path=word/footer1.xml><?xml version="1.0" encoding="utf-8"?>

</xml_diff>